<commit_message>
Standardize PCHSMB document architecture and add estimated cost breakdown tables
</commit_message>
<xml_diff>
--- a/PCHSMB/_Backdrop/docs/Backdrop_Assembly_Guide.docx
+++ b/PCHSMB/_Backdrop/docs/Backdrop_Assembly_Guide.docx
@@ -2537,6 +2537,254 @@
     <w:p>
       <w:pPr>
         <w:pStyle w:val="Heading2"/>
+      </w:pPr>
+      <w:r>
+        <w:t xml:space="preserve">Estimated fabrication cost breakdown</w:t>
+      </w:r>
+    </w:p>
+    <w:p>
+      <w:r>
+        <w:t xml:space="preserve">The following table itemizes estimated material costs per backdrop prop based on standard retail pricing (excluding custom printed vinyl):</w:t>
+      </w:r>
+    </w:p>
+    <w:tbl>
+      <w:tblPr>
+        <w:tblW w:w="9360" w:type="dxa"/>
+        <w:tblBorders>
+          <w:top w:val="single" w:sz="4" w:space="0" w:color="CCCCCC"/>
+          <w:left w:val="none"/>
+          <w:bottom w:val="single" w:sz="4" w:space="0" w:color="CCCCCC"/>
+          <w:right w:val="none"/>
+          <w:insideH w:val="single" w:sz="4" w:space="0" w:color="EAEAEA"/>
+          <w:insideV w:val="none"/>
+        </w:tblBorders>
+      </w:tblPr>
+      <w:tr>
+        <w:trPr>
+          <w:tblHeader/>
+        </w:trPr>
+        <w:tc>
+          <w:tcPr>
+            <w:tcW w:w="3000" w:type="dxa"/>
+            <w:shd w:val="clear" w:color="auto" w:fill="EAEAEA"/>
+          </w:tcPr>
+          <w:p>
+            <w:r>
+              <w:rPr>
+                <w:b/>
+                <w:sz w:val="18"/>
+              </w:rPr>
+              <w:t>Subsystem / Category</w:t>
+            </w:r>
+          </w:p>
+        </w:tc>
+        <w:tc>
+          <w:tcPr>
+            <w:tcW w:w="4800" w:type="dxa"/>
+            <w:shd w:val="clear" w:color="auto" w:fill="EAEAEA"/>
+          </w:tcPr>
+          <w:p>
+            <w:r>
+              <w:rPr>
+                <w:b/>
+                <w:sz w:val="18"/>
+              </w:rPr>
+              <w:t>Items Included</w:t>
+            </w:r>
+          </w:p>
+        </w:tc>
+        <w:tc>
+          <w:tcPr>
+            <w:tcW w:w="1560" w:type="dxa"/>
+            <w:shd w:val="clear" w:color="auto" w:fill="EAEAEA"/>
+          </w:tcPr>
+          <w:p>
+            <w:r>
+              <w:rPr>
+                <w:b/>
+                <w:sz w:val="18"/>
+              </w:rPr>
+              <w:t>Est. Cost</w:t>
+            </w:r>
+          </w:p>
+        </w:tc>
+      </w:tr>
+      <w:tr>
+        <w:tc>
+          <w:p>
+            <w:r>
+              <w:t>Cart Base Framing</w:t>
+            </w:r>
+          </w:p>
+        </w:tc>
+        <w:tc>
+          <w:p>
+            <w:r>
+              <w:t>8x 2x4 SPF lumber, 1/2 sheet 1/2" plywood, GRK screws, paint</w:t>
+            </w:r>
+          </w:p>
+        </w:tc>
+        <w:tc>
+          <w:p>
+            <w:r>
+              <w:t>$98.00</w:t>
+            </w:r>
+          </w:p>
+        </w:tc>
+      </w:tr>
+      <w:tr>
+        <w:tc>
+          <w:p>
+            <w:r>
+              <w:t>Casters &amp; Bumpers</w:t>
+            </w:r>
+          </w:p>
+        </w:tc>
+        <w:tc>
+          <w:p>
+            <w:r>
+              <w:t>4x Heavy-duty swivel casters w/ brakes, 4x ASA corner bumpers</w:t>
+            </w:r>
+          </w:p>
+        </w:tc>
+        <w:tc>
+          <w:p>
+            <w:r>
+              <w:t>$51.00</w:t>
+            </w:r>
+          </w:p>
+        </w:tc>
+      </w:tr>
+      <w:tr>
+        <w:tc>
+          <w:p>
+            <w:r>
+              <w:t>Ballast Posts &amp; Tote</w:t>
+            </w:r>
+          </w:p>
+        </w:tc>
+        <w:tc>
+          <w:p>
+            <w:r>
+              <w:t>2x 3/4" flanges &amp; 18" pipes, carriage bolts, 1x HDX 14-gal tote</w:t>
+            </w:r>
+          </w:p>
+        </w:tc>
+        <w:tc>
+          <w:p>
+            <w:r>
+              <w:t>$46.00</w:t>
+            </w:r>
+          </w:p>
+        </w:tc>
+      </w:tr>
+      <w:tr>
+        <w:tc>
+          <w:p>
+            <w:r>
+              <w:t>Upright Steel Frame</w:t>
+            </w:r>
+          </w:p>
+        </w:tc>
+        <w:tc>
+          <w:p>
+            <w:r>
+              <w:t>2x 10-ft 16-ga fence posts, 2x 8-ft top rails, 4x 3-way brackets, bands</w:t>
+            </w:r>
+          </w:p>
+        </w:tc>
+        <w:tc>
+          <w:p>
+            <w:r>
+              <w:t>$121.00</w:t>
+            </w:r>
+          </w:p>
+        </w:tc>
+      </w:tr>
+      <w:tr>
+        <w:tc>
+          <w:p>
+            <w:r>
+              <w:t>Diagonal Struts &amp; Mounts</w:t>
+            </w:r>
+          </w:p>
+        </w:tc>
+        <w:tc>
+          <w:p>
+            <w:r>
+              <w:t>1x 10-ft top rail (2 struts), 4x end caps, tension bands, 2x U-bolts</w:t>
+            </w:r>
+          </w:p>
+        </w:tc>
+        <w:tc>
+          <w:p>
+            <w:r>
+              <w:t>$49.50</w:t>
+            </w:r>
+          </w:p>
+        </w:tc>
+      </w:tr>
+      <w:tr>
+        <w:tc>
+          <w:p>
+            <w:r>
+              <w:t>Vinyl Attachment Hardware</w:t>
+            </w:r>
+          </w:p>
+        </w:tc>
+        <w:tc>
+          <w:p>
+            <w:r>
+              <w:t>1-5/8" snap clamps pack, heavy-duty carpet tape, pilot hardware</w:t>
+            </w:r>
+          </w:p>
+        </w:tc>
+        <w:tc>
+          <w:p>
+            <w:r>
+              <w:t>$25.00</w:t>
+            </w:r>
+          </w:p>
+        </w:tc>
+      </w:tr>
+      <w:tr>
+        <w:tc>
+          <w:p>
+            <w:r>
+              <w:rPr>
+                <w:b/>
+              </w:rPr>
+              <w:t>TOTAL PER PROP (EXCL. VINYL)</w:t>
+            </w:r>
+          </w:p>
+        </w:tc>
+        <w:tc>
+          <w:p>
+            <w:r>
+              <w:t>Hardware &amp; lumber complete chassis</w:t>
+            </w:r>
+          </w:p>
+        </w:tc>
+        <w:tc>
+          <w:p>
+            <w:r>
+              <w:rPr>
+                <w:b/>
+              </w:rPr>
+              <w:t>~$390.00</w:t>
+            </w:r>
+          </w:p>
+        </w:tc>
+      </w:tr>
+    </w:tbl>
+    <w:p>
+      <w:r>
+        <w:t xml:space="preserve">Optional Rule 8.05 Ballast Pack: 4–6 Abccanopy 15-lb handle sandbags + inner double-bag liners + traction sand adds approximately +$37.00 per cart.</w:t>
+      </w:r>
+    </w:p>
+    <w:p>
+      <w:pPr>
+        <w:pStyle w:val="Heading2"/>
         <w:pageBreakBefore/>
       </w:pPr>
       <w:r>

</xml_diff>